<commit_message>
docs: add the "never fabricate acknowledgement" story to the technical insight
- New decision 3.4: never fabricate an acknowledgement (the strongest
  product-thinking point) — a medical system reporting a false "done" is
  worse than reporting nothing.
- New war story 4.4: how the bug was caught by end-to-end testing against
  the live database, not by compiling.
- Reminder lifecycle now shows the No response branch and that Completed
  only ever comes from a real tap.
- New judge Q&A: "How do you know the senior actually took the medicine?"

Co-Authored-By: Claude Opus 4.8 <noreply@anthropic.com>
</commit_message>
<xml_diff>
--- a/docs/Technical-Insight-Remember-For-Me.docx
+++ b/docs/Technical-Insight-Remember-For-Me.docx
@@ -447,7 +447,7 @@
           <w:sz w:val="30"/>
           <w:szCs w:val="30"/>
         </w:rPr>
-        <w:t xml:space="preserve">3. Năm quyết định kỹ thuật then chốt</w:t>
+        <w:t xml:space="preserve">3. Sáu quyết định kỹ thuật then chốt</w:t>
       </w:r>
     </w:p>
     <w:p>
@@ -897,7 +897,204 @@
           <w:sz w:val="24"/>
           <w:szCs w:val="24"/>
         </w:rPr>
-        <w:t xml:space="preserve">3.4  Suy giảm êm (graceful degradation) ở mọi tầng</w:t>
+        <w:t xml:space="preserve">3.4  Không bao giờ bịa ra sự xác nhận  ★★</w:t>
+      </w:r>
+    </w:p>
+    <w:p>
+      <w:pPr>
+        <w:spacing w:after="120" w:line="276"/>
+      </w:pPr>
+      <w:r>
+        <w:rPr>
+          <w:color w:val="18243B"/>
+          <w:sz w:val="21"/>
+          <w:szCs w:val="21"/>
+        </w:rPr>
+        <w:t xml:space="preserve">Đây là bài học sâu nhất của dự án. Bản đầu, kiosk </w:t>
+      </w:r>
+      <w:r>
+        <w:rPr>
+          <w:b/>
+          <w:bCs/>
+          <w:color w:val="C91818"/>
+          <w:sz w:val="21"/>
+          <w:szCs w:val="21"/>
+        </w:rPr>
+        <w:t xml:space="preserve">tự đánh dấu Completed</w:t>
+      </w:r>
+      <w:r>
+        <w:rPr>
+          <w:color w:val="18243B"/>
+          <w:sz w:val="21"/>
+          <w:szCs w:val="21"/>
+        </w:rPr>
+        <w:t xml:space="preserve"> ngay khi đọc xong lời nhắc (~7 giây), và ghi log </w:t>
+      </w:r>
+      <w:r>
+        <w:rPr>
+          <w:i/>
+          <w:iCs/>
+          <w:color w:val="18243B"/>
+          <w:sz w:val="21"/>
+          <w:szCs w:val="21"/>
+        </w:rPr>
+        <w:t xml:space="preserve">“acknowledged by [tên cụ]”</w:t>
+      </w:r>
+      <w:r>
+        <w:rPr>
+          <w:color w:val="18243B"/>
+          <w:sz w:val="21"/>
+          <w:szCs w:val="21"/>
+        </w:rPr>
+        <w:t xml:space="preserve"> — dù </w:t>
+      </w:r>
+      <w:r>
+        <w:rPr>
+          <w:b/>
+          <w:bCs/>
+          <w:color w:val="18243B"/>
+          <w:sz w:val="21"/>
+          <w:szCs w:val="21"/>
+        </w:rPr>
+        <w:t xml:space="preserve">không ai chạm vào màn hình.</w:t>
+      </w:r>
+    </w:p>
+    <w:p>
+      <w:pPr>
+        <w:spacing w:after="120" w:line="276"/>
+      </w:pPr>
+      <w:r>
+        <w:rPr>
+          <w:color w:val="18243B"/>
+          <w:sz w:val="21"/>
+          <w:szCs w:val="21"/>
+        </w:rPr>
+        <w:t xml:space="preserve">Nghĩa là hệ thống </w:t>
+      </w:r>
+      <w:r>
+        <w:rPr>
+          <w:b/>
+          <w:bCs/>
+          <w:color w:val="C91818"/>
+          <w:sz w:val="21"/>
+          <w:szCs w:val="21"/>
+        </w:rPr>
+        <w:t xml:space="preserve">báo cáo sai cho người con rằng cụ đã uống thuốc.</w:t>
+      </w:r>
+      <w:r>
+        <w:rPr>
+          <w:color w:val="18243B"/>
+          <w:sz w:val="21"/>
+          <w:szCs w:val="21"/>
+        </w:rPr>
+        <w:t xml:space="preserve"> Với một sản phẩm y tế, </w:t>
+      </w:r>
+      <w:r>
+        <w:rPr>
+          <w:b/>
+          <w:bCs/>
+          <w:color w:val="1D5BD8"/>
+          <w:sz w:val="21"/>
+          <w:szCs w:val="21"/>
+        </w:rPr>
+        <w:t xml:space="preserve">báo sai còn nguy hiểm hơn không báo gì</w:t>
+      </w:r>
+      <w:r>
+        <w:rPr>
+          <w:color w:val="18243B"/>
+          <w:sz w:val="21"/>
+          <w:szCs w:val="21"/>
+        </w:rPr>
+        <w:t xml:space="preserve"> — người con yên tâm nhầm và không đi kiểm tra.</w:t>
+      </w:r>
+    </w:p>
+    <w:p>
+      <w:pPr>
+        <w:spacing w:after="120" w:line="276"/>
+      </w:pPr>
+      <w:r>
+        <w:rPr>
+          <w:color w:val="18243B"/>
+          <w:sz w:val="21"/>
+          <w:szCs w:val="21"/>
+        </w:rPr>
+        <w:t xml:space="preserve">Đã sửa: lời nhắc giờ </w:t>
+      </w:r>
+      <w:r>
+        <w:rPr>
+          <w:b/>
+          <w:bCs/>
+          <w:color w:val="1E7A45"/>
+          <w:sz w:val="21"/>
+          <w:szCs w:val="21"/>
+        </w:rPr>
+        <w:t xml:space="preserve">chờ cụ thật sự bấm “Đã hiểu”.</w:t>
+      </w:r>
+      <w:r>
+        <w:rPr>
+          <w:color w:val="18243B"/>
+          <w:sz w:val="21"/>
+          <w:szCs w:val="21"/>
+        </w:rPr>
+        <w:t xml:space="preserve"> Hết 60 giây không ai bấm → ghi trạng thái </w:t>
+      </w:r>
+      <w:r>
+        <w:rPr>
+          <w:rFonts w:ascii="Consolas" w:cs="Consolas" w:eastAsia="Consolas" w:hAnsi="Consolas"/>
+          <w:color w:val="18243B"/>
+          <w:sz w:val="21"/>
+          <w:szCs w:val="21"/>
+        </w:rPr>
+        <w:t xml:space="preserve">“No response”</w:t>
+      </w:r>
+      <w:r>
+        <w:rPr>
+          <w:color w:val="18243B"/>
+          <w:sz w:val="21"/>
+          <w:szCs w:val="21"/>
+        </w:rPr>
+        <w:t xml:space="preserve"> (không phải Completed) và báo người con — chứ không tự nhận thay cụ.</w:t>
+      </w:r>
+    </w:p>
+    <w:p>
+      <w:pPr>
+        <w:spacing w:after="120" w:line="276"/>
+      </w:pPr>
+      <w:r>
+        <w:rPr>
+          <w:b/>
+          <w:bCs/>
+          <w:color w:val="18243B"/>
+          <w:sz w:val="21"/>
+          <w:szCs w:val="21"/>
+        </w:rPr>
+        <w:t xml:space="preserve">Nguyên tắc rút ra: </w:t>
+      </w:r>
+      <w:r>
+        <w:rPr>
+          <w:i/>
+          <w:iCs/>
+          <w:color w:val="18243B"/>
+          <w:sz w:val="21"/>
+          <w:szCs w:val="21"/>
+        </w:rPr>
+        <w:t xml:space="preserve">hệ thống chỉ được khẳng định những gì nó THỰC SỰ quan sát được. Phần còn lại phải nói thẳng là mình không biết.</w:t>
+      </w:r>
+    </w:p>
+    <w:p>
+      <w:pPr>
+        <w:pStyle w:val="Heading2"/>
+        <w:spacing w:after="120" w:before="240"/>
+      </w:pPr>
+      <w:r>
+        <w:rPr>
+          <w:b/>
+          <w:bCs/>
+          <w:color w:val="18243B"/>
+          <w:sz w:val="24"/>
+          <w:szCs w:val="24"/>
+        </w:rPr>
+        <w:t xml:space="preserve">3.5  Suy giảm êm (graceful degradation) ở mọi tầng</w:t>
       </w:r>
     </w:p>
     <w:p>
@@ -964,7 +1161,7 @@
           <w:sz w:val="24"/>
           <w:szCs w:val="24"/>
         </w:rPr>
-        <w:t xml:space="preserve">3.5  Flutter cho kiosk, React cho dashboard</w:t>
+        <w:t xml:space="preserve">3.6  Flutter cho kiosk, React cho dashboard</w:t>
       </w:r>
     </w:p>
     <w:p>
@@ -1512,7 +1709,251 @@
           <w:sz w:val="24"/>
           <w:szCs w:val="24"/>
         </w:rPr>
-        <w:t xml:space="preserve">4.4  Stacking context của Leaflet</w:t>
+        <w:t xml:space="preserve">4.4  Bug “tự xác nhận” — bắt được nhờ test end-to-end với dữ liệu thật</w:t>
+      </w:r>
+    </w:p>
+    <w:p>
+      <w:pPr>
+        <w:pStyle w:val="ListParagraph"/>
+        <w:numPr>
+          <w:ilvl w:val="0"/>
+          <w:numId w:val="2"/>
+        </w:numPr>
+        <w:spacing w:after="60" w:line="276"/>
+      </w:pPr>
+      <w:r>
+        <w:rPr>
+          <w:b/>
+          <w:bCs/>
+          <w:color w:val="C91818"/>
+          <w:sz w:val="21"/>
+          <w:szCs w:val="21"/>
+        </w:rPr>
+        <w:t xml:space="preserve">Phát hiện: </w:t>
+      </w:r>
+      <w:r>
+        <w:rPr>
+          <w:color w:val="18243B"/>
+          <w:sz w:val="21"/>
+          <w:szCs w:val="21"/>
+        </w:rPr>
+        <w:t xml:space="preserve">chạy thử trên database thật thấy task tự nhảy </w:t>
+      </w:r>
+      <w:r>
+        <w:rPr>
+          <w:rFonts w:ascii="Consolas" w:cs="Consolas" w:eastAsia="Consolas" w:hAnsi="Consolas"/>
+          <w:color w:val="18243B"/>
+          <w:sz w:val="21"/>
+          <w:szCs w:val="21"/>
+        </w:rPr>
+        <w:t xml:space="preserve">Completed</w:t>
+      </w:r>
+      <w:r>
+        <w:rPr>
+          <w:color w:val="18243B"/>
+          <w:sz w:val="21"/>
+          <w:szCs w:val="21"/>
+        </w:rPr>
+        <w:t xml:space="preserve"> chỉ ~9 giây sau khi trigger, dù không ai bấm gì.</w:t>
+      </w:r>
+    </w:p>
+    <w:p>
+      <w:pPr>
+        <w:pStyle w:val="ListParagraph"/>
+        <w:numPr>
+          <w:ilvl w:val="0"/>
+          <w:numId w:val="2"/>
+        </w:numPr>
+        <w:spacing w:after="60" w:line="276"/>
+      </w:pPr>
+      <w:r>
+        <w:rPr>
+          <w:b/>
+          <w:bCs/>
+          <w:color w:val="18243B"/>
+          <w:sz w:val="21"/>
+          <w:szCs w:val="21"/>
+        </w:rPr>
+        <w:t xml:space="preserve">Đào sâu: </w:t>
+      </w:r>
+      <w:r>
+        <w:rPr>
+          <w:color w:val="18243B"/>
+          <w:sz w:val="21"/>
+          <w:szCs w:val="21"/>
+        </w:rPr>
+        <w:t xml:space="preserve">hàm tự-dismiss sau khi đọc xong gọi </w:t>
+      </w:r>
+      <w:r>
+        <w:rPr>
+          <w:rFonts w:ascii="Consolas" w:cs="Consolas" w:eastAsia="Consolas" w:hAnsi="Consolas"/>
+          <w:color w:val="18243B"/>
+          <w:sz w:val="21"/>
+          <w:szCs w:val="21"/>
+        </w:rPr>
+        <w:t xml:space="preserve">markTaskSpoken()</w:t>
+      </w:r>
+      <w:r>
+        <w:rPr>
+          <w:color w:val="18243B"/>
+          <w:sz w:val="21"/>
+          <w:szCs w:val="21"/>
+        </w:rPr>
+        <w:t xml:space="preserve">, vốn ghi thẳng </w:t>
+      </w:r>
+      <w:r>
+        <w:rPr>
+          <w:rFonts w:ascii="Consolas" w:cs="Consolas" w:eastAsia="Consolas" w:hAnsi="Consolas"/>
+          <w:color w:val="18243B"/>
+          <w:sz w:val="21"/>
+          <w:szCs w:val="21"/>
+        </w:rPr>
+        <w:t xml:space="preserve">status: Completed</w:t>
+      </w:r>
+      <w:r>
+        <w:rPr>
+          <w:color w:val="18243B"/>
+          <w:sz w:val="21"/>
+          <w:szCs w:val="21"/>
+        </w:rPr>
+        <w:t xml:space="preserve"> — một mặc định sai về mặt sản phẩm.</w:t>
+      </w:r>
+    </w:p>
+    <w:p>
+      <w:pPr>
+        <w:pStyle w:val="ListParagraph"/>
+        <w:numPr>
+          <w:ilvl w:val="0"/>
+          <w:numId w:val="2"/>
+        </w:numPr>
+        <w:spacing w:after="60" w:line="276"/>
+      </w:pPr>
+      <w:r>
+        <w:rPr>
+          <w:b/>
+          <w:bCs/>
+          <w:color w:val="1E7A45"/>
+          <w:sz w:val="21"/>
+          <w:szCs w:val="21"/>
+        </w:rPr>
+        <w:t xml:space="preserve">Sửa: </w:t>
+      </w:r>
+      <w:r>
+        <w:rPr>
+          <w:color w:val="18243B"/>
+          <w:sz w:val="21"/>
+          <w:szCs w:val="21"/>
+        </w:rPr>
+        <w:t xml:space="preserve">tách hẳn hai đường — cụ bấm nút thì </w:t>
+      </w:r>
+      <w:r>
+        <w:rPr>
+          <w:rFonts w:ascii="Consolas" w:cs="Consolas" w:eastAsia="Consolas" w:hAnsi="Consolas"/>
+          <w:color w:val="18243B"/>
+          <w:sz w:val="21"/>
+          <w:szCs w:val="21"/>
+        </w:rPr>
+        <w:t xml:space="preserve">Completed</w:t>
+      </w:r>
+      <w:r>
+        <w:rPr>
+          <w:color w:val="18243B"/>
+          <w:sz w:val="21"/>
+          <w:szCs w:val="21"/>
+        </w:rPr>
+        <w:t xml:space="preserve">; hết giờ thì </w:t>
+      </w:r>
+      <w:r>
+        <w:rPr>
+          <w:rFonts w:ascii="Consolas" w:cs="Consolas" w:eastAsia="Consolas" w:hAnsi="Consolas"/>
+          <w:color w:val="18243B"/>
+          <w:sz w:val="21"/>
+          <w:szCs w:val="21"/>
+        </w:rPr>
+        <w:t xml:space="preserve">No response</w:t>
+      </w:r>
+      <w:r>
+        <w:rPr>
+          <w:color w:val="18243B"/>
+          <w:sz w:val="21"/>
+          <w:szCs w:val="21"/>
+        </w:rPr>
+        <w:t xml:space="preserve">. Kiểm chứng lại end-to-end: trigger → phát giọng 2/2 → 60s không bấm → đúng </w:t>
+      </w:r>
+      <w:r>
+        <w:rPr>
+          <w:rFonts w:ascii="Consolas" w:cs="Consolas" w:eastAsia="Consolas" w:hAnsi="Consolas"/>
+          <w:color w:val="18243B"/>
+          <w:sz w:val="21"/>
+          <w:szCs w:val="21"/>
+        </w:rPr>
+        <w:t xml:space="preserve">No response</w:t>
+      </w:r>
+      <w:r>
+        <w:rPr>
+          <w:color w:val="18243B"/>
+          <w:sz w:val="21"/>
+          <w:szCs w:val="21"/>
+        </w:rPr>
+        <w:t xml:space="preserve">, </w:t>
+      </w:r>
+      <w:r>
+        <w:rPr>
+          <w:rFonts w:ascii="Consolas" w:cs="Consolas" w:eastAsia="Consolas" w:hAnsi="Consolas"/>
+          <w:color w:val="18243B"/>
+          <w:sz w:val="21"/>
+          <w:szCs w:val="21"/>
+        </w:rPr>
+        <w:t xml:space="preserve">completedAt = null</w:t>
+      </w:r>
+      <w:r>
+        <w:rPr>
+          <w:color w:val="18243B"/>
+          <w:sz w:val="21"/>
+          <w:szCs w:val="21"/>
+        </w:rPr>
+        <w:t xml:space="preserve">.</w:t>
+      </w:r>
+    </w:p>
+    <w:p>
+      <w:pPr>
+        <w:spacing w:after="120" w:line="276"/>
+      </w:pPr>
+      <w:r>
+        <w:rPr>
+          <w:b/>
+          <w:bCs/>
+          <w:color w:val="18243B"/>
+          <w:sz w:val="21"/>
+          <w:szCs w:val="21"/>
+        </w:rPr>
+        <w:t xml:space="preserve">Bài học quy trình: </w:t>
+      </w:r>
+      <w:r>
+        <w:rPr>
+          <w:i/>
+          <w:iCs/>
+          <w:color w:val="5A6B87"/>
+          <w:sz w:val="21"/>
+          <w:szCs w:val="21"/>
+        </w:rPr>
+        <w:t xml:space="preserve">compile sạch không đủ. Chỉ khi chạy thật với dữ liệu thật mới lộ ra hệ thống đang “nói dối” về việc cụ đã làm gì.</w:t>
+      </w:r>
+    </w:p>
+    <w:p>
+      <w:pPr>
+        <w:pStyle w:val="Heading2"/>
+        <w:spacing w:after="120" w:before="240"/>
+      </w:pPr>
+      <w:r>
+        <w:rPr>
+          <w:b/>
+          <w:bCs/>
+          <w:color w:val="18243B"/>
+          <w:sz w:val="24"/>
+          <w:szCs w:val="24"/>
+        </w:rPr>
+        <w:t xml:space="preserve">4.5  Stacking context của Leaflet</w:t>
       </w:r>
     </w:p>
     <w:p>
@@ -2427,7 +2868,7 @@
           <w:sz w:val="21"/>
           <w:szCs w:val="21"/>
         </w:rPr>
-        <w:t xml:space="preserve"> → (cụ bấm “Đã hiểu”) → </w:t>
+        <w:t xml:space="preserve"> → cụ bấm “Đã hiểu” → </w:t>
       </w:r>
       <w:r>
         <w:rPr>
@@ -2444,7 +2885,93 @@
           <w:sz w:val="21"/>
           <w:szCs w:val="21"/>
         </w:rPr>
-        <w:t xml:space="preserve">. Hai client độc lập cùng đẩy state machine này tiến lên.</w:t>
+        <w:t xml:space="preserve">, HOẶC hết 60 giây không phản hồi → </w:t>
+      </w:r>
+      <w:r>
+        <w:rPr>
+          <w:rFonts w:ascii="Consolas" w:cs="Consolas" w:eastAsia="Consolas" w:hAnsi="Consolas"/>
+          <w:b/>
+          <w:bCs/>
+          <w:color w:val="B97400"/>
+          <w:sz w:val="21"/>
+          <w:szCs w:val="21"/>
+        </w:rPr>
+        <w:t xml:space="preserve">No response</w:t>
+      </w:r>
+      <w:r>
+        <w:rPr>
+          <w:color w:val="18243B"/>
+          <w:sz w:val="21"/>
+          <w:szCs w:val="21"/>
+        </w:rPr>
+        <w:t xml:space="preserve">.</w:t>
+      </w:r>
+    </w:p>
+    <w:p>
+      <w:pPr>
+        <w:spacing w:after="120" w:line="276"/>
+      </w:pPr>
+      <w:r>
+        <w:rPr>
+          <w:b/>
+          <w:bCs/>
+          <w:color w:val="18243B"/>
+          <w:sz w:val="21"/>
+          <w:szCs w:val="21"/>
+        </w:rPr>
+        <w:t xml:space="preserve">Điểm mấu chốt: </w:t>
+      </w:r>
+      <w:r>
+        <w:rPr>
+          <w:rFonts w:ascii="Consolas" w:cs="Consolas" w:eastAsia="Consolas" w:hAnsi="Consolas"/>
+          <w:color w:val="18243B"/>
+          <w:sz w:val="21"/>
+          <w:szCs w:val="21"/>
+        </w:rPr>
+        <w:t xml:space="preserve">Completed</w:t>
+      </w:r>
+      <w:r>
+        <w:rPr>
+          <w:color w:val="18243B"/>
+          <w:sz w:val="21"/>
+          <w:szCs w:val="21"/>
+        </w:rPr>
+        <w:t xml:space="preserve"> chỉ đến từ </w:t>
+      </w:r>
+      <w:r>
+        <w:rPr>
+          <w:b/>
+          <w:bCs/>
+          <w:color w:val="18243B"/>
+          <w:sz w:val="21"/>
+          <w:szCs w:val="21"/>
+        </w:rPr>
+        <w:t xml:space="preserve">thao tác thật của cụ</w:t>
+      </w:r>
+      <w:r>
+        <w:rPr>
+          <w:color w:val="18243B"/>
+          <w:sz w:val="21"/>
+          <w:szCs w:val="21"/>
+        </w:rPr>
+        <w:t xml:space="preserve">. Hệ thống không bao giờ tự chuyển sang Completed thay cụ — trạng thái </w:t>
+      </w:r>
+      <w:r>
+        <w:rPr>
+          <w:rFonts w:ascii="Consolas" w:cs="Consolas" w:eastAsia="Consolas" w:hAnsi="Consolas"/>
+          <w:color w:val="18243B"/>
+          <w:sz w:val="21"/>
+          <w:szCs w:val="21"/>
+        </w:rPr>
+        <w:t xml:space="preserve">No response</w:t>
+      </w:r>
+      <w:r>
+        <w:rPr>
+          <w:color w:val="18243B"/>
+          <w:sz w:val="21"/>
+          <w:szCs w:val="21"/>
+        </w:rPr>
+        <w:t xml:space="preserve"> tồn tại chính vì lẽ đó.</w:t>
       </w:r>
     </w:p>
     <w:p>
@@ -3187,6 +3714,55 @@
           <w:sz w:val="21"/>
           <w:szCs w:val="21"/>
         </w:rPr>
+        <w:t xml:space="preserve">Làm sao biết cụ thật sự uống thuốc chứ không phải hệ thống tự nhận?</w:t>
+      </w:r>
+    </w:p>
+    <w:p>
+      <w:pPr>
+        <w:spacing w:after="100" w:line="276"/>
+        <w:ind w:left="280"/>
+      </w:pPr>
+      <w:r>
+        <w:rPr>
+          <w:b/>
+          <w:bCs/>
+          <w:color w:val="1E7A45"/>
+          <w:sz w:val="21"/>
+          <w:szCs w:val="21"/>
+        </w:rPr>
+        <w:t xml:space="preserve">A:  </w:t>
+      </w:r>
+      <w:r>
+        <w:rPr>
+          <w:color w:val="18243B"/>
+          <w:sz w:val="21"/>
+          <w:szCs w:val="21"/>
+        </w:rPr>
+        <w:t xml:space="preserve">Câu này chạm đúng vào một quyết định quan trọng của tụi em. Bản đầu, kiosk tự đánh dấu 'đã xong' ngay sau khi đọc lời nhắc, dù cụ không chạm vào màn hình. Tụi em nhận ra đó là sai lầm nghiêm trọng: một hệ thống y tế báo sai còn nguy hiểm hơn không báo — người con yên tâm nhầm rồi không đi kiểm tra. Nên tụi em bỏ hẳn. Giờ 'Completed' chỉ đến từ việc cụ thật sự bấm nút; nếu 60 giây không ai bấm, hệ thống ghi 'No response' và báo người con, chứ không tự nhận thay. Nói ngắn gọn: hệ thống chỉ khẳng định những gì nó thật sự quan sát được.</w:t>
+      </w:r>
+    </w:p>
+    <w:p>
+      <w:pPr>
+        <w:spacing w:after="60" w:before="200"/>
+      </w:pPr>
+      <w:r>
+        <w:rPr>
+          <w:b/>
+          <w:bCs/>
+          <w:color w:val="1D5BD8"/>
+          <w:sz w:val="21"/>
+          <w:szCs w:val="21"/>
+        </w:rPr>
+        <w:t xml:space="preserve">Q:  </w:t>
+      </w:r>
+      <w:r>
+        <w:rPr>
+          <w:b/>
+          <w:bCs/>
+          <w:color w:val="18243B"/>
+          <w:sz w:val="21"/>
+          <w:szCs w:val="21"/>
+        </w:rPr>
         <w:t xml:space="preserve">Chỉ số nhịp tim là thật hay giả?</w:t>
       </w:r>
     </w:p>

</xml_diff>